<commit_message>
Fix resume timeline to match portfolio
</commit_message>
<xml_diff>
--- a/docs/Arnold_Biliran_Resume.docx
+++ b/docs/Arnold_Biliran_Resume.docx
@@ -64,7 +64,7 @@
           <w:sz w:val="18"/>
           <w:szCs w:val="18"/>
         </w:rPr>
-        <w:t xml:space="preserve">Portfolio: arnoldbiliran-svg.github.io/arnoldbiliran-portfolio   |   GitHub: github.com/arnoldbiliran-svg   |   YouTube: @abiliran</w:t>
+        <w:t xml:space="preserve">Portfolio: arnoldbiliran-svg.github.io/arnoldbiliran-portfolio   |   GitHub: github.com/arnoldbiliran-svg</w:t>
       </w:r>
     </w:p>
     <w:p>
@@ -337,7 +337,7 @@
           <w:sz w:val="21"/>
           <w:szCs w:val="21"/>
         </w:rPr>
-        <w:t xml:space="preserve">Freelance Full-Stack Developer &amp; Digital Entrepreneur</w:t>
+        <w:t xml:space="preserve">Digital Entrepreneur &amp; Full-Stack Developer</w:t>
       </w:r>
       <w:r>
         <w:rPr>
@@ -348,7 +348,7 @@
           <w:sz w:val="21"/>
           <w:szCs w:val="21"/>
         </w:rPr>
-        <w:t xml:space="preserve">  —  Self-Employed, Davao City, Philippines</w:t>
+        <w:t xml:space="preserve">  —  Independent, Davao City, Philippines</w:t>
       </w:r>
       <w:r>
         <w:rPr>
@@ -357,45 +357,83 @@
           <w:sz w:val="19"/>
           <w:szCs w:val="19"/>
         </w:rPr>
-        <w:t xml:space="preserve">	2022 – Present</w:t>
-      </w:r>
-    </w:p>
-    <w:p>
-      <w:pPr>
-        <w:pStyle w:val="ListParagraph"/>
-        <w:numPr>
-          <w:ilvl w:val="0"/>
-          <w:numId w:val="2"/>
-        </w:numPr>
-        <w:spacing w:after="40"/>
-      </w:pPr>
-      <w:r>
-        <w:rPr>
-          <w:rFonts w:ascii="Calibri" w:cs="Calibri" w:eastAsia="Calibri" w:hAnsi="Calibri"/>
-          <w:color w:val="222222"/>
-          <w:sz w:val="20"/>
-          <w:szCs w:val="20"/>
-        </w:rPr>
-        <w:t xml:space="preserve">Design and build full-stack business management systems (TypeScript, React, Express, PostgreSQL/Supabase), including a pharmacy POS and inventory platform with FEFO inventory tracking, Senior Citizen/PWD discount logic, VAT calculation, and BIR-compliant receipt generation</w:t>
-      </w:r>
-    </w:p>
-    <w:p>
-      <w:pPr>
-        <w:pStyle w:val="ListParagraph"/>
-        <w:numPr>
-          <w:ilvl w:val="0"/>
-          <w:numId w:val="2"/>
-        </w:numPr>
-        <w:spacing w:after="40"/>
-      </w:pPr>
-      <w:r>
-        <w:rPr>
-          <w:rFonts w:ascii="Calibri" w:cs="Calibri" w:eastAsia="Calibri" w:hAnsi="Calibri"/>
-          <w:color w:val="222222"/>
-          <w:sz w:val="20"/>
-          <w:szCs w:val="20"/>
-        </w:rPr>
-        <w:t xml:space="preserve">Develop and maintain a standalone offline POS tool with cross-browser/iOS compatibility fixes, deployed via Netlify</w:t>
+        <w:t xml:space="preserve">	Jul 2024 – Present</w:t>
+      </w:r>
+    </w:p>
+    <w:p>
+      <w:pPr>
+        <w:pStyle w:val="ListParagraph"/>
+        <w:numPr>
+          <w:ilvl w:val="0"/>
+          <w:numId w:val="2"/>
+        </w:numPr>
+        <w:spacing w:after="40"/>
+      </w:pPr>
+      <w:r>
+        <w:rPr>
+          <w:rFonts w:ascii="Calibri" w:cs="Calibri" w:eastAsia="Calibri" w:hAnsi="Calibri"/>
+          <w:color w:val="222222"/>
+          <w:sz w:val="20"/>
+          <w:szCs w:val="20"/>
+        </w:rPr>
+        <w:t xml:space="preserve">Authored and self-published 4 eBooks, including "From Graveyard Shift to Passive Income" and "From Restaurant Manager to Digital Entrepreneur" (co-authored), distributed via Gumroad and Payhip and marketed through Facebook, TikTok, and Instagram</w:t>
+      </w:r>
+    </w:p>
+    <w:p>
+      <w:pPr>
+        <w:pStyle w:val="ListParagraph"/>
+        <w:numPr>
+          <w:ilvl w:val="0"/>
+          <w:numId w:val="2"/>
+        </w:numPr>
+        <w:spacing w:after="40"/>
+      </w:pPr>
+      <w:r>
+        <w:rPr>
+          <w:rFonts w:ascii="Calibri" w:cs="Calibri" w:eastAsia="Calibri" w:hAnsi="Calibri"/>
+          <w:color w:val="222222"/>
+          <w:sz w:val="20"/>
+          <w:szCs w:val="20"/>
+        </w:rPr>
+        <w:t xml:space="preserve">Transitioned into full-stack software development, using AI-assisted development tools to design and build full-stack business management systems (TypeScript, React, Express, PostgreSQL/Supabase)</w:t>
+      </w:r>
+    </w:p>
+    <w:p>
+      <w:pPr>
+        <w:pStyle w:val="ListParagraph"/>
+        <w:numPr>
+          <w:ilvl w:val="0"/>
+          <w:numId w:val="2"/>
+        </w:numPr>
+        <w:spacing w:after="40"/>
+      </w:pPr>
+      <w:r>
+        <w:rPr>
+          <w:rFonts w:ascii="Calibri" w:cs="Calibri" w:eastAsia="Calibri" w:hAnsi="Calibri"/>
+          <w:color w:val="222222"/>
+          <w:sz w:val="20"/>
+          <w:szCs w:val="20"/>
+        </w:rPr>
+        <w:t xml:space="preserve">Built a pharmacy POS and inventory platform with FEFO inventory tracking, Senior Citizen/PWD discount logic, VAT calculation, and BIR-compliant receipt generation</w:t>
+      </w:r>
+    </w:p>
+    <w:p>
+      <w:pPr>
+        <w:pStyle w:val="ListParagraph"/>
+        <w:numPr>
+          <w:ilvl w:val="0"/>
+          <w:numId w:val="2"/>
+        </w:numPr>
+        <w:spacing w:after="40"/>
+      </w:pPr>
+      <w:r>
+        <w:rPr>
+          <w:rFonts w:ascii="Calibri" w:cs="Calibri" w:eastAsia="Calibri" w:hAnsi="Calibri"/>
+          <w:color w:val="222222"/>
+          <w:sz w:val="20"/>
+          <w:szCs w:val="20"/>
+        </w:rPr>
+        <w:t xml:space="preserve">Developed and maintain a standalone offline POS tool with cross-browser/iOS compatibility fixes, deployed via Netlify</w:t>
       </w:r>
     </w:p>
     <w:p>
@@ -415,44 +453,6 @@
           <w:szCs w:val="20"/>
         </w:rPr>
         <w:t xml:space="preserve">Author comprehensive technical documentation (architecture, API, database schema, business rules) for production systems</w:t>
-      </w:r>
-    </w:p>
-    <w:p>
-      <w:pPr>
-        <w:pStyle w:val="ListParagraph"/>
-        <w:numPr>
-          <w:ilvl w:val="0"/>
-          <w:numId w:val="2"/>
-        </w:numPr>
-        <w:spacing w:after="40"/>
-      </w:pPr>
-      <w:r>
-        <w:rPr>
-          <w:rFonts w:ascii="Calibri" w:cs="Calibri" w:eastAsia="Calibri" w:hAnsi="Calibri"/>
-          <w:color w:val="222222"/>
-          <w:sz w:val="20"/>
-          <w:szCs w:val="20"/>
-        </w:rPr>
-        <w:t xml:space="preserve">Write and self-publish digital products (eBooks) on Gumroad and Payhip, including full sales copy and product documentation</w:t>
-      </w:r>
-    </w:p>
-    <w:p>
-      <w:pPr>
-        <w:pStyle w:val="ListParagraph"/>
-        <w:numPr>
-          <w:ilvl w:val="0"/>
-          <w:numId w:val="2"/>
-        </w:numPr>
-        <w:spacing w:after="40"/>
-      </w:pPr>
-      <w:r>
-        <w:rPr>
-          <w:rFonts w:ascii="Calibri" w:cs="Calibri" w:eastAsia="Calibri" w:hAnsi="Calibri"/>
-          <w:color w:val="222222"/>
-          <w:sz w:val="20"/>
-          <w:szCs w:val="20"/>
-        </w:rPr>
-        <w:t xml:space="preserve">Produce content across YouTube (@abiliran) and Instagram, combining copywriting, video editing, and graphic design</w:t>
       </w:r>
     </w:p>
     <w:p>
@@ -780,7 +780,7 @@
           <w:sz w:val="19"/>
           <w:szCs w:val="19"/>
         </w:rPr>
-        <w:t xml:space="preserve">	Jun 2014 – Jun 2016</w:t>
+        <w:t xml:space="preserve">	Apr 2014 – Feb 2017</w:t>
       </w:r>
     </w:p>
     <w:p>

</xml_diff>